<commit_message>
Adding notes 2 && 3 for asp.net core
</commit_message>
<xml_diff>
--- a/ASP.net-Core/ASP.Net-Core-Notes-02.docx
+++ b/ASP.net-Core/ASP.Net-Core-Notes-02.docx
@@ -174,9 +174,19 @@
           <w:szCs w:val="19"/>
           <w:highlight w:val="white"/>
         </w:rPr>
-        <w:t xml:space="preserve">&gt;&gt; </w:t>
-      </w:r>
-      <w:proofErr w:type="gramStart"/>
+        <w:t>&gt;&gt; CreatePost(</w:t>
+      </w:r>
+      <w:r>
+        <w:rPr>
+          <w:rFonts w:ascii="Cascadia Mono" w:hAnsi="Cascadia Mono" w:cs="Cascadia Mono"/>
+          <w:color w:val="2B91AF"/>
+          <w:kern w:val="0"/>
+          <w:sz w:val="19"/>
+          <w:szCs w:val="19"/>
+          <w:highlight w:val="white"/>
+        </w:rPr>
+        <w:t>Post</w:t>
+      </w:r>
       <w:r>
         <w:rPr>
           <w:rFonts w:ascii="Cascadia Mono" w:hAnsi="Cascadia Mono" w:cs="Cascadia Mono"/>
@@ -186,21 +196,15 @@
           <w:szCs w:val="19"/>
           <w:highlight w:val="white"/>
         </w:rPr>
-        <w:t>CreatePost(</w:t>
-      </w:r>
-      <w:proofErr w:type="gramEnd"/>
-      <w:r>
-        <w:rPr>
-          <w:rFonts w:ascii="Cascadia Mono" w:hAnsi="Cascadia Mono" w:cs="Cascadia Mono"/>
-          <w:color w:val="2B91AF"/>
-          <w:kern w:val="0"/>
-          <w:sz w:val="19"/>
-          <w:szCs w:val="19"/>
-          <w:highlight w:val="white"/>
-        </w:rPr>
-        <w:t>Post</w:t>
-      </w:r>
-      <w:r>
+        <w:t xml:space="preserve"> post)</w:t>
+      </w:r>
+    </w:p>
+    <w:p>
+      <w:pPr>
+        <w:autoSpaceDE w:val="0"/>
+        <w:autoSpaceDN w:val="0"/>
+        <w:adjustRightInd w:val="0"/>
+        <w:spacing w:after="0" w:line="240" w:lineRule="auto"/>
         <w:rPr>
           <w:rFonts w:ascii="Cascadia Mono" w:hAnsi="Cascadia Mono" w:cs="Cascadia Mono"/>
           <w:color w:val="000000"/>
@@ -209,15 +213,8 @@
           <w:szCs w:val="19"/>
           <w:highlight w:val="white"/>
         </w:rPr>
-        <w:t xml:space="preserve"> post)</w:t>
-      </w:r>
-    </w:p>
-    <w:p>
-      <w:pPr>
-        <w:autoSpaceDE w:val="0"/>
-        <w:autoSpaceDN w:val="0"/>
-        <w:adjustRightInd w:val="0"/>
-        <w:spacing w:after="0" w:line="240" w:lineRule="auto"/>
+      </w:pPr>
+      <w:r>
         <w:rPr>
           <w:rFonts w:ascii="Cascadia Mono" w:hAnsi="Cascadia Mono" w:cs="Cascadia Mono"/>
           <w:color w:val="000000"/>
@@ -226,8 +223,15 @@
           <w:szCs w:val="19"/>
           <w:highlight w:val="white"/>
         </w:rPr>
-      </w:pPr>
-      <w:r>
+        <w:t>{</w:t>
+      </w:r>
+    </w:p>
+    <w:p>
+      <w:pPr>
+        <w:autoSpaceDE w:val="0"/>
+        <w:autoSpaceDN w:val="0"/>
+        <w:adjustRightInd w:val="0"/>
+        <w:spacing w:after="0" w:line="240" w:lineRule="auto"/>
         <w:rPr>
           <w:rFonts w:ascii="Cascadia Mono" w:hAnsi="Cascadia Mono" w:cs="Cascadia Mono"/>
           <w:color w:val="000000"/>
@@ -236,15 +240,8 @@
           <w:szCs w:val="19"/>
           <w:highlight w:val="white"/>
         </w:rPr>
-        <w:t>{</w:t>
-      </w:r>
-    </w:p>
-    <w:p>
-      <w:pPr>
-        <w:autoSpaceDE w:val="0"/>
-        <w:autoSpaceDN w:val="0"/>
-        <w:adjustRightInd w:val="0"/>
-        <w:spacing w:after="0" w:line="240" w:lineRule="auto"/>
+      </w:pPr>
+      <w:r>
         <w:rPr>
           <w:rFonts w:ascii="Cascadia Mono" w:hAnsi="Cascadia Mono" w:cs="Cascadia Mono"/>
           <w:color w:val="000000"/>
@@ -253,7 +250,19 @@
           <w:szCs w:val="19"/>
           <w:highlight w:val="white"/>
         </w:rPr>
-      </w:pPr>
+        <w:t xml:space="preserve">    </w:t>
+      </w:r>
+      <w:r>
+        <w:rPr>
+          <w:rFonts w:ascii="Cascadia Mono" w:hAnsi="Cascadia Mono" w:cs="Cascadia Mono"/>
+          <w:color w:val="0000FF"/>
+          <w:kern w:val="0"/>
+          <w:sz w:val="19"/>
+          <w:szCs w:val="19"/>
+          <w:highlight w:val="white"/>
+        </w:rPr>
+        <w:t>await</w:t>
+      </w:r>
       <w:r>
         <w:rPr>
           <w:rFonts w:ascii="Cascadia Mono" w:hAnsi="Cascadia Mono" w:cs="Cascadia Mono"/>
@@ -263,6 +272,49 @@
           <w:szCs w:val="19"/>
           <w:highlight w:val="white"/>
         </w:rPr>
+        <w:t xml:space="preserve"> _postsService.CreatePost(post);</w:t>
+      </w:r>
+    </w:p>
+    <w:p>
+      <w:pPr>
+        <w:autoSpaceDE w:val="0"/>
+        <w:autoSpaceDN w:val="0"/>
+        <w:adjustRightInd w:val="0"/>
+        <w:spacing w:after="0" w:line="240" w:lineRule="auto"/>
+        <w:rPr>
+          <w:rFonts w:ascii="Cascadia Mono" w:hAnsi="Cascadia Mono" w:cs="Cascadia Mono"/>
+          <w:color w:val="000000"/>
+          <w:kern w:val="0"/>
+          <w:sz w:val="19"/>
+          <w:szCs w:val="19"/>
+          <w:highlight w:val="white"/>
+        </w:rPr>
+      </w:pPr>
+    </w:p>
+    <w:p>
+      <w:pPr>
+        <w:autoSpaceDE w:val="0"/>
+        <w:autoSpaceDN w:val="0"/>
+        <w:adjustRightInd w:val="0"/>
+        <w:spacing w:after="0" w:line="240" w:lineRule="auto"/>
+        <w:rPr>
+          <w:rFonts w:ascii="Cascadia Mono" w:hAnsi="Cascadia Mono" w:cs="Cascadia Mono"/>
+          <w:color w:val="000000"/>
+          <w:kern w:val="0"/>
+          <w:sz w:val="19"/>
+          <w:szCs w:val="19"/>
+          <w:highlight w:val="white"/>
+        </w:rPr>
+      </w:pPr>
+      <w:r>
+        <w:rPr>
+          <w:rFonts w:ascii="Cascadia Mono" w:hAnsi="Cascadia Mono" w:cs="Cascadia Mono"/>
+          <w:color w:val="000000"/>
+          <w:kern w:val="0"/>
+          <w:sz w:val="19"/>
+          <w:szCs w:val="19"/>
+          <w:highlight w:val="white"/>
+        </w:rPr>
         <w:t xml:space="preserve">    </w:t>
       </w:r>
       <w:r>
@@ -274,7 +326,7 @@
           <w:szCs w:val="19"/>
           <w:highlight w:val="white"/>
         </w:rPr>
-        <w:t>await</w:t>
+        <w:t>return</w:t>
       </w:r>
       <w:r>
         <w:rPr>
@@ -285,15 +337,20 @@
           <w:szCs w:val="19"/>
           <w:highlight w:val="white"/>
         </w:rPr>
-        <w:t xml:space="preserve"> _postsService.CreatePost(post);</w:t>
-      </w:r>
-    </w:p>
-    <w:p>
-      <w:pPr>
-        <w:autoSpaceDE w:val="0"/>
-        <w:autoSpaceDN w:val="0"/>
-        <w:adjustRightInd w:val="0"/>
-        <w:spacing w:after="0" w:line="240" w:lineRule="auto"/>
+        <w:t xml:space="preserve"> CreatedAtAction(</w:t>
+      </w:r>
+      <w:r>
+        <w:rPr>
+          <w:rFonts w:ascii="Cascadia Mono" w:hAnsi="Cascadia Mono" w:cs="Cascadia Mono"/>
+          <w:color w:val="0000FF"/>
+          <w:kern w:val="0"/>
+          <w:sz w:val="19"/>
+          <w:szCs w:val="19"/>
+          <w:highlight w:val="white"/>
+        </w:rPr>
+        <w:t>nameof</w:t>
+      </w:r>
+      <w:r>
         <w:rPr>
           <w:rFonts w:ascii="Cascadia Mono" w:hAnsi="Cascadia Mono" w:cs="Cascadia Mono"/>
           <w:color w:val="000000"/>
@@ -302,14 +359,20 @@
           <w:szCs w:val="19"/>
           <w:highlight w:val="white"/>
         </w:rPr>
-      </w:pPr>
-    </w:p>
-    <w:p>
-      <w:pPr>
-        <w:autoSpaceDE w:val="0"/>
-        <w:autoSpaceDN w:val="0"/>
-        <w:adjustRightInd w:val="0"/>
-        <w:spacing w:after="0" w:line="240" w:lineRule="auto"/>
+        <w:t xml:space="preserve">(GetPost), </w:t>
+      </w:r>
+      <w:r>
+        <w:rPr>
+          <w:rFonts w:ascii="Cascadia Mono" w:hAnsi="Cascadia Mono" w:cs="Cascadia Mono"/>
+          <w:color w:val="0000FF"/>
+          <w:kern w:val="0"/>
+          <w:sz w:val="19"/>
+          <w:szCs w:val="19"/>
+          <w:highlight w:val="white"/>
+        </w:rPr>
+        <w:t>new</w:t>
+      </w:r>
+      <w:r>
         <w:rPr>
           <w:rFonts w:ascii="Cascadia Mono" w:hAnsi="Cascadia Mono" w:cs="Cascadia Mono"/>
           <w:color w:val="000000"/>
@@ -318,6 +381,18 @@
           <w:szCs w:val="19"/>
           <w:highlight w:val="white"/>
         </w:rPr>
+        <w:t xml:space="preserve"> { id = post.Id}, post);</w:t>
+      </w:r>
+    </w:p>
+    <w:p>
+      <w:pPr>
+        <w:rPr>
+          <w:rFonts w:ascii="Cascadia Mono" w:hAnsi="Cascadia Mono" w:cs="Cascadia Mono"/>
+          <w:color w:val="000000"/>
+          <w:kern w:val="0"/>
+          <w:sz w:val="19"/>
+          <w:szCs w:val="19"/>
+        </w:rPr>
       </w:pPr>
       <w:r>
         <w:rPr>
@@ -328,173 +403,52 @@
           <w:szCs w:val="19"/>
           <w:highlight w:val="white"/>
         </w:rPr>
-        <w:t xml:space="preserve">    </w:t>
-      </w:r>
-      <w:r>
-        <w:rPr>
-          <w:rFonts w:ascii="Cascadia Mono" w:hAnsi="Cascadia Mono" w:cs="Cascadia Mono"/>
-          <w:color w:val="0000FF"/>
-          <w:kern w:val="0"/>
-          <w:sz w:val="19"/>
-          <w:szCs w:val="19"/>
-          <w:highlight w:val="white"/>
-        </w:rPr>
-        <w:t>return</w:t>
-      </w:r>
-      <w:r>
-        <w:rPr>
-          <w:rFonts w:ascii="Cascadia Mono" w:hAnsi="Cascadia Mono" w:cs="Cascadia Mono"/>
-          <w:color w:val="000000"/>
-          <w:kern w:val="0"/>
-          <w:sz w:val="19"/>
-          <w:szCs w:val="19"/>
-          <w:highlight w:val="white"/>
-        </w:rPr>
-        <w:t xml:space="preserve"> CreatedAtAction(</w:t>
-      </w:r>
-      <w:proofErr w:type="gramStart"/>
-      <w:r>
-        <w:rPr>
-          <w:rFonts w:ascii="Cascadia Mono" w:hAnsi="Cascadia Mono" w:cs="Cascadia Mono"/>
-          <w:color w:val="0000FF"/>
-          <w:kern w:val="0"/>
-          <w:sz w:val="19"/>
-          <w:szCs w:val="19"/>
-          <w:highlight w:val="white"/>
-        </w:rPr>
-        <w:t>nameof</w:t>
-      </w:r>
-      <w:r>
-        <w:rPr>
-          <w:rFonts w:ascii="Cascadia Mono" w:hAnsi="Cascadia Mono" w:cs="Cascadia Mono"/>
-          <w:color w:val="000000"/>
-          <w:kern w:val="0"/>
-          <w:sz w:val="19"/>
-          <w:szCs w:val="19"/>
-          <w:highlight w:val="white"/>
-        </w:rPr>
-        <w:t>(</w:t>
-      </w:r>
-      <w:proofErr w:type="gramEnd"/>
-      <w:r>
-        <w:rPr>
-          <w:rFonts w:ascii="Cascadia Mono" w:hAnsi="Cascadia Mono" w:cs="Cascadia Mono"/>
-          <w:color w:val="000000"/>
-          <w:kern w:val="0"/>
-          <w:sz w:val="19"/>
-          <w:szCs w:val="19"/>
-          <w:highlight w:val="white"/>
-        </w:rPr>
-        <w:t xml:space="preserve">GetPost), </w:t>
-      </w:r>
-      <w:r>
-        <w:rPr>
-          <w:rFonts w:ascii="Cascadia Mono" w:hAnsi="Cascadia Mono" w:cs="Cascadia Mono"/>
-          <w:color w:val="0000FF"/>
-          <w:kern w:val="0"/>
-          <w:sz w:val="19"/>
-          <w:szCs w:val="19"/>
-          <w:highlight w:val="white"/>
-        </w:rPr>
-        <w:t>new</w:t>
-      </w:r>
-      <w:r>
-        <w:rPr>
-          <w:rFonts w:ascii="Cascadia Mono" w:hAnsi="Cascadia Mono" w:cs="Cascadia Mono"/>
-          <w:color w:val="000000"/>
-          <w:kern w:val="0"/>
-          <w:sz w:val="19"/>
-          <w:szCs w:val="19"/>
-          <w:highlight w:val="white"/>
+        <w:t>}</w:t>
+      </w:r>
+    </w:p>
+    <w:p>
+      <w:pPr>
+        <w:rPr>
+          <w:rFonts w:ascii="Sakkal Majalla" w:hAnsi="Sakkal Majalla" w:cs="Sakkal Majalla"/>
+          <w:sz w:val="28"/>
+          <w:szCs w:val="28"/>
+        </w:rPr>
+      </w:pPr>
+      <w:r>
+        <w:rPr>
+          <w:rFonts w:ascii="Sakkal Majalla" w:hAnsi="Sakkal Majalla" w:cs="Sakkal Majalla"/>
+          <w:sz w:val="28"/>
+          <w:szCs w:val="28"/>
+        </w:rPr>
+        <w:t xml:space="preserve">When we call this endpoint, the post object will be serialized in the </w:t>
+      </w:r>
+      <w:r>
+        <w:rPr>
+          <w:rFonts w:ascii="Sakkal Majalla" w:hAnsi="Sakkal Majalla" w:cs="Sakkal Majalla"/>
+          <w:i/>
+          <w:iCs/>
+          <w:color w:val="BF4E14" w:themeColor="accent2" w:themeShade="BF"/>
+          <w:sz w:val="28"/>
+          <w:szCs w:val="28"/>
+        </w:rPr>
+        <w:t>JSON</w:t>
+      </w:r>
+      <w:r>
+        <w:rPr>
+          <w:rFonts w:ascii="Sakkal Majalla" w:hAnsi="Sakkal Majalla" w:cs="Sakkal Majalla"/>
+          <w:color w:val="BF4E14" w:themeColor="accent2" w:themeShade="BF"/>
+          <w:sz w:val="28"/>
+          <w:szCs w:val="28"/>
         </w:rPr>
         <w:t xml:space="preserve"> </w:t>
       </w:r>
-      <w:proofErr w:type="gramStart"/>
-      <w:r>
-        <w:rPr>
-          <w:rFonts w:ascii="Cascadia Mono" w:hAnsi="Cascadia Mono" w:cs="Cascadia Mono"/>
-          <w:color w:val="000000"/>
-          <w:kern w:val="0"/>
-          <w:sz w:val="19"/>
-          <w:szCs w:val="19"/>
-          <w:highlight w:val="white"/>
-        </w:rPr>
-        <w:t>{ id</w:t>
-      </w:r>
-      <w:proofErr w:type="gramEnd"/>
-      <w:r>
-        <w:rPr>
-          <w:rFonts w:ascii="Cascadia Mono" w:hAnsi="Cascadia Mono" w:cs="Cascadia Mono"/>
-          <w:color w:val="000000"/>
-          <w:kern w:val="0"/>
-          <w:sz w:val="19"/>
-          <w:szCs w:val="19"/>
-          <w:highlight w:val="white"/>
-        </w:rPr>
-        <w:t xml:space="preserve"> = </w:t>
-      </w:r>
-      <w:proofErr w:type="gramStart"/>
-      <w:r>
-        <w:rPr>
-          <w:rFonts w:ascii="Cascadia Mono" w:hAnsi="Cascadia Mono" w:cs="Cascadia Mono"/>
-          <w:color w:val="000000"/>
-          <w:kern w:val="0"/>
-          <w:sz w:val="19"/>
-          <w:szCs w:val="19"/>
-          <w:highlight w:val="white"/>
-        </w:rPr>
-        <w:t>post.Id</w:t>
-      </w:r>
-      <w:proofErr w:type="gramEnd"/>
-      <w:r>
-        <w:rPr>
-          <w:rFonts w:ascii="Cascadia Mono" w:hAnsi="Cascadia Mono" w:cs="Cascadia Mono"/>
-          <w:color w:val="000000"/>
-          <w:kern w:val="0"/>
-          <w:sz w:val="19"/>
-          <w:szCs w:val="19"/>
-          <w:highlight w:val="white"/>
-        </w:rPr>
-        <w:t>}, post);</w:t>
-      </w:r>
-    </w:p>
-    <w:p>
-      <w:pPr>
-        <w:rPr>
-          <w:rFonts w:ascii="Cascadia Mono" w:hAnsi="Cascadia Mono" w:cs="Cascadia Mono"/>
-          <w:color w:val="000000"/>
-          <w:kern w:val="0"/>
-          <w:sz w:val="19"/>
-          <w:szCs w:val="19"/>
-        </w:rPr>
-      </w:pPr>
-      <w:r>
-        <w:rPr>
-          <w:rFonts w:ascii="Cascadia Mono" w:hAnsi="Cascadia Mono" w:cs="Cascadia Mono"/>
-          <w:color w:val="000000"/>
-          <w:kern w:val="0"/>
-          <w:sz w:val="19"/>
-          <w:szCs w:val="19"/>
-          <w:highlight w:val="white"/>
-        </w:rPr>
-        <w:t>}</w:t>
-      </w:r>
-    </w:p>
-    <w:p>
-      <w:pPr>
-        <w:rPr>
-          <w:rFonts w:ascii="Sakkal Majalla" w:hAnsi="Sakkal Majalla" w:cs="Sakkal Majalla"/>
-          <w:sz w:val="28"/>
-          <w:szCs w:val="28"/>
-        </w:rPr>
-      </w:pPr>
-      <w:r>
-        <w:rPr>
-          <w:rFonts w:ascii="Sakkal Majalla" w:hAnsi="Sakkal Majalla" w:cs="Sakkal Majalla"/>
-          <w:sz w:val="28"/>
-          <w:szCs w:val="28"/>
-        </w:rPr>
-        <w:t xml:space="preserve">When we call this endpoint, the post object will be serialized in the </w:t>
+      <w:r>
+        <w:rPr>
+          <w:rFonts w:ascii="Sakkal Majalla" w:hAnsi="Sakkal Majalla" w:cs="Sakkal Majalla"/>
+          <w:sz w:val="28"/>
+          <w:szCs w:val="28"/>
+        </w:rPr>
+        <w:t xml:space="preserve">format that is attached to the </w:t>
       </w:r>
       <w:r>
         <w:rPr>
@@ -505,7 +459,7 @@
           <w:sz w:val="28"/>
           <w:szCs w:val="28"/>
         </w:rPr>
-        <w:t>JSON</w:t>
+        <w:t>POST</w:t>
       </w:r>
       <w:r>
         <w:rPr>
@@ -522,7 +476,7 @@
           <w:sz w:val="28"/>
           <w:szCs w:val="28"/>
         </w:rPr>
-        <w:t xml:space="preserve">format that is attached to the </w:t>
+        <w:t xml:space="preserve">request body. In this method, we can get the post from the request and then call the </w:t>
       </w:r>
       <w:r>
         <w:rPr>
@@ -533,7 +487,7 @@
           <w:sz w:val="28"/>
           <w:szCs w:val="28"/>
         </w:rPr>
-        <w:t>POST</w:t>
+        <w:t>CreatePost()</w:t>
       </w:r>
       <w:r>
         <w:rPr>
@@ -550,9 +504,8 @@
           <w:sz w:val="28"/>
           <w:szCs w:val="28"/>
         </w:rPr>
-        <w:t xml:space="preserve">request body. In this method, we can get the post from the request and then call the </w:t>
-      </w:r>
-      <w:proofErr w:type="gramStart"/>
+        <w:t xml:space="preserve">method in the service to create a new post. Then, we will return the built-in </w:t>
+      </w:r>
       <w:r>
         <w:rPr>
           <w:rFonts w:ascii="Sakkal Majalla" w:hAnsi="Sakkal Majalla" w:cs="Sakkal Majalla"/>
@@ -562,9 +515,16 @@
           <w:sz w:val="28"/>
           <w:szCs w:val="28"/>
         </w:rPr>
-        <w:t>CreatePost(</w:t>
-      </w:r>
-      <w:proofErr w:type="gramEnd"/>
+        <w:t>CreatedAtAction</w:t>
+      </w:r>
+      <w:r>
+        <w:rPr>
+          <w:rFonts w:ascii="Sakkal Majalla" w:hAnsi="Sakkal Majalla" w:cs="Sakkal Majalla"/>
+          <w:sz w:val="28"/>
+          <w:szCs w:val="28"/>
+        </w:rPr>
+        <w:t xml:space="preserve">, which returns a response message </w:t>
+      </w:r>
       <w:r>
         <w:rPr>
           <w:rFonts w:ascii="Sakkal Majalla" w:hAnsi="Sakkal Majalla" w:cs="Sakkal Majalla"/>
@@ -574,24 +534,34 @@
           <w:sz w:val="28"/>
           <w:szCs w:val="28"/>
         </w:rPr>
-        <w:t>)</w:t>
-      </w:r>
-      <w:r>
-        <w:rPr>
-          <w:rFonts w:ascii="Sakkal Majalla" w:hAnsi="Sakkal Majalla" w:cs="Sakkal Majalla"/>
+        <w:t>with the specified action name</w:t>
+      </w:r>
+      <w:r>
+        <w:rPr>
+          <w:rFonts w:ascii="Sakkal Majalla" w:hAnsi="Sakkal Majalla" w:cs="Sakkal Majalla"/>
+          <w:sz w:val="28"/>
+          <w:szCs w:val="28"/>
+        </w:rPr>
+        <w:t xml:space="preserve">, </w:t>
+      </w:r>
+      <w:r>
+        <w:rPr>
+          <w:rFonts w:ascii="Sakkal Majalla" w:hAnsi="Sakkal Majalla" w:cs="Sakkal Majalla"/>
+          <w:i/>
+          <w:iCs/>
           <w:color w:val="BF4E14" w:themeColor="accent2" w:themeShade="BF"/>
           <w:sz w:val="28"/>
           <w:szCs w:val="28"/>
         </w:rPr>
-        <w:t xml:space="preserve"> </w:t>
-      </w:r>
-      <w:r>
-        <w:rPr>
-          <w:rFonts w:ascii="Sakkal Majalla" w:hAnsi="Sakkal Majalla" w:cs="Sakkal Majalla"/>
-          <w:sz w:val="28"/>
-          <w:szCs w:val="28"/>
-        </w:rPr>
-        <w:t xml:space="preserve">method in the service to create a new post. Then, we will return the built-in </w:t>
+        <w:t>route values</w:t>
+      </w:r>
+      <w:r>
+        <w:rPr>
+          <w:rFonts w:ascii="Sakkal Majalla" w:hAnsi="Sakkal Majalla" w:cs="Sakkal Majalla"/>
+          <w:sz w:val="28"/>
+          <w:szCs w:val="28"/>
+        </w:rPr>
+        <w:t xml:space="preserve">, and </w:t>
       </w:r>
       <w:r>
         <w:rPr>
@@ -602,15 +572,15 @@
           <w:sz w:val="28"/>
           <w:szCs w:val="28"/>
         </w:rPr>
-        <w:t>CreatedAtAction</w:t>
-      </w:r>
-      <w:r>
-        <w:rPr>
-          <w:rFonts w:ascii="Sakkal Majalla" w:hAnsi="Sakkal Majalla" w:cs="Sakkal Majalla"/>
-          <w:sz w:val="28"/>
-          <w:szCs w:val="28"/>
-        </w:rPr>
-        <w:t xml:space="preserve">, which returns a response message </w:t>
+        <w:t>post</w:t>
+      </w:r>
+      <w:r>
+        <w:rPr>
+          <w:rFonts w:ascii="Sakkal Majalla" w:hAnsi="Sakkal Majalla" w:cs="Sakkal Majalla"/>
+          <w:sz w:val="28"/>
+          <w:szCs w:val="28"/>
+        </w:rPr>
+        <w:t xml:space="preserve">. For this case, it will call the </w:t>
       </w:r>
       <w:r>
         <w:rPr>
@@ -621,77 +591,7 @@
           <w:sz w:val="28"/>
           <w:szCs w:val="28"/>
         </w:rPr>
-        <w:t>with the specified action name</w:t>
-      </w:r>
-      <w:r>
-        <w:rPr>
-          <w:rFonts w:ascii="Sakkal Majalla" w:hAnsi="Sakkal Majalla" w:cs="Sakkal Majalla"/>
-          <w:sz w:val="28"/>
-          <w:szCs w:val="28"/>
-        </w:rPr>
-        <w:t xml:space="preserve">, </w:t>
-      </w:r>
-      <w:r>
-        <w:rPr>
-          <w:rFonts w:ascii="Sakkal Majalla" w:hAnsi="Sakkal Majalla" w:cs="Sakkal Majalla"/>
-          <w:i/>
-          <w:iCs/>
-          <w:color w:val="BF4E14" w:themeColor="accent2" w:themeShade="BF"/>
-          <w:sz w:val="28"/>
-          <w:szCs w:val="28"/>
-        </w:rPr>
-        <w:t>route values</w:t>
-      </w:r>
-      <w:r>
-        <w:rPr>
-          <w:rFonts w:ascii="Sakkal Majalla" w:hAnsi="Sakkal Majalla" w:cs="Sakkal Majalla"/>
-          <w:sz w:val="28"/>
-          <w:szCs w:val="28"/>
-        </w:rPr>
-        <w:t xml:space="preserve">, and </w:t>
-      </w:r>
-      <w:r>
-        <w:rPr>
-          <w:rFonts w:ascii="Sakkal Majalla" w:hAnsi="Sakkal Majalla" w:cs="Sakkal Majalla"/>
-          <w:i/>
-          <w:iCs/>
-          <w:color w:val="BF4E14" w:themeColor="accent2" w:themeShade="BF"/>
-          <w:sz w:val="28"/>
-          <w:szCs w:val="28"/>
-        </w:rPr>
-        <w:t>post</w:t>
-      </w:r>
-      <w:r>
-        <w:rPr>
-          <w:rFonts w:ascii="Sakkal Majalla" w:hAnsi="Sakkal Majalla" w:cs="Sakkal Majalla"/>
-          <w:sz w:val="28"/>
-          <w:szCs w:val="28"/>
-        </w:rPr>
-        <w:t xml:space="preserve">. For this case, it will call the </w:t>
-      </w:r>
-      <w:proofErr w:type="gramStart"/>
-      <w:r>
-        <w:rPr>
-          <w:rFonts w:ascii="Sakkal Majalla" w:hAnsi="Sakkal Majalla" w:cs="Sakkal Majalla"/>
-          <w:i/>
-          <w:iCs/>
-          <w:color w:val="BF4E14" w:themeColor="accent2" w:themeShade="BF"/>
-          <w:sz w:val="28"/>
-          <w:szCs w:val="28"/>
-        </w:rPr>
-        <w:t>GetPost(</w:t>
-      </w:r>
-      <w:proofErr w:type="gramEnd"/>
-      <w:r>
-        <w:rPr>
-          <w:rFonts w:ascii="Sakkal Majalla" w:hAnsi="Sakkal Majalla" w:cs="Sakkal Majalla"/>
-          <w:i/>
-          <w:iCs/>
-          <w:color w:val="BF4E14" w:themeColor="accent2" w:themeShade="BF"/>
-          <w:sz w:val="28"/>
-          <w:szCs w:val="28"/>
-        </w:rPr>
-        <w:t>)</w:t>
+        <w:t>GetPost()</w:t>
       </w:r>
       <w:r>
         <w:rPr>
@@ -793,27 +693,7 @@
           <w:sz w:val="28"/>
           <w:szCs w:val="28"/>
         </w:rPr>
-        <w:t>'</w:t>
-      </w:r>
-      <w:proofErr w:type="gramStart"/>
-      <w:r>
-        <w:rPr>
-          <w:rFonts w:ascii="Sakkal Majalla" w:hAnsi="Sakkal Majalla" w:cs="Sakkal Majalla"/>
-          <w:color w:val="156082" w:themeColor="accent1"/>
-          <w:sz w:val="28"/>
-          <w:szCs w:val="28"/>
-        </w:rPr>
-        <w:t>MyFirstAPI.Controllers.PostsController</w:t>
-      </w:r>
-      <w:proofErr w:type="gramEnd"/>
-      <w:r>
-        <w:rPr>
-          <w:rFonts w:ascii="Sakkal Majalla" w:hAnsi="Sakkal Majalla" w:cs="Sakkal Majalla"/>
-          <w:color w:val="156082" w:themeColor="accent1"/>
-          <w:sz w:val="28"/>
-          <w:szCs w:val="28"/>
-        </w:rPr>
-        <w:t xml:space="preserve">' </w:t>
+        <w:t xml:space="preserve">'MyFirstAPI.Controllers.PostsController' </w:t>
       </w:r>
       <w:r>
         <w:rPr>
@@ -2252,7 +2132,6 @@
         <w:lastRenderedPageBreak/>
         <w:t xml:space="preserve">This DI feature is provided in a NuGet package called </w:t>
       </w:r>
-      <w:proofErr w:type="gramStart"/>
       <w:r>
         <w:rPr>
           <w:rFonts w:ascii="Sakkal Majalla" w:hAnsi="Sakkal Majalla" w:cs="Sakkal Majalla"/>
@@ -2262,7 +2141,6 @@
         </w:rPr>
         <w:t>Microsoft.Extensions.DependencyInjection</w:t>
       </w:r>
-      <w:proofErr w:type="gramEnd"/>
       <w:r>
         <w:rPr>
           <w:rFonts w:ascii="Sakkal Majalla" w:hAnsi="Sakkal Majalla" w:cs="Sakkal Majalla"/>
@@ -2292,21 +2170,8 @@
           <w:sz w:val="28"/>
           <w:szCs w:val="28"/>
         </w:rPr>
-        <w:t xml:space="preserve">dotnet add package </w:t>
-      </w:r>
-      <w:proofErr w:type="gramStart"/>
-      <w:r>
-        <w:rPr>
-          <w:rFonts w:ascii="Sakkal Majalla" w:hAnsi="Sakkal Majalla" w:cs="Sakkal Majalla"/>
-          <w:i/>
-          <w:iCs/>
-          <w:color w:val="0070C0"/>
-          <w:sz w:val="28"/>
-          <w:szCs w:val="28"/>
-        </w:rPr>
-        <w:t>Microsoft.Extensions.DependencyInjection</w:t>
-      </w:r>
-      <w:proofErr w:type="gramEnd"/>
+        <w:t>dotnet add package Microsoft.Extensions.DependencyInjection</w:t>
+      </w:r>
     </w:p>
     <w:p>
       <w:pPr>
@@ -2568,6 +2433,7 @@
       <w:r>
         <w:rPr>
           <w:rFonts w:ascii="Sakkal Majalla" w:hAnsi="Sakkal Majalla" w:cs="Sakkal Majalla"/>
+          <w:noProof/>
           <w:sz w:val="28"/>
           <w:szCs w:val="28"/>
         </w:rPr>
@@ -3046,6 +2912,7 @@
       <w:r>
         <w:rPr>
           <w:rFonts w:ascii="Sakkal Majalla" w:hAnsi="Sakkal Majalla" w:cs="Sakkal Majalla"/>
+          <w:noProof/>
           <w:sz w:val="28"/>
           <w:szCs w:val="28"/>
         </w:rPr>
@@ -3115,6 +2982,7 @@
       <w:r>
         <w:rPr>
           <w:rFonts w:ascii="Sakkal Majalla" w:hAnsi="Sakkal Majalla" w:cs="Sakkal Majalla"/>
+          <w:noProof/>
           <w:sz w:val="28"/>
           <w:szCs w:val="28"/>
         </w:rPr>
@@ -3193,6 +3061,7 @@
       <w:r>
         <w:rPr>
           <w:rFonts w:ascii="Sakkal Majalla" w:hAnsi="Sakkal Majalla" w:cs="Sakkal Majalla"/>
+          <w:noProof/>
           <w:sz w:val="28"/>
           <w:szCs w:val="28"/>
         </w:rPr>
@@ -3410,25 +3279,7 @@
           <w:sz w:val="28"/>
           <w:szCs w:val="28"/>
         </w:rPr>
-        <w:t xml:space="preserve">using </w:t>
-      </w:r>
-      <w:proofErr w:type="gramStart"/>
-      <w:r>
-        <w:rPr>
-          <w:rFonts w:ascii="Sakkal Majalla" w:hAnsi="Sakkal Majalla" w:cs="Sakkal Majalla"/>
-          <w:sz w:val="28"/>
-          <w:szCs w:val="28"/>
-        </w:rPr>
-        <w:t>this.postService</w:t>
-      </w:r>
-      <w:proofErr w:type="gramEnd"/>
-      <w:r>
-        <w:rPr>
-          <w:rFonts w:ascii="Sakkal Majalla" w:hAnsi="Sakkal Majalla" w:cs="Sakkal Majalla"/>
-          <w:sz w:val="28"/>
-          <w:szCs w:val="28"/>
-        </w:rPr>
-        <w:t xml:space="preserve"> or from external code.</w:t>
+        <w:t>using this.postService or from external code.</w:t>
       </w:r>
     </w:p>
     <w:p>
@@ -3495,6 +3346,7 @@
       <w:r>
         <w:rPr>
           <w:rFonts w:ascii="Sakkal Majalla" w:hAnsi="Sakkal Majalla" w:cs="Sakkal Majalla"/>
+          <w:noProof/>
           <w:sz w:val="28"/>
           <w:szCs w:val="28"/>
         </w:rPr>
@@ -3787,13 +3639,6 @@
           <w:szCs w:val="28"/>
         </w:rPr>
         <w:tab/>
-      </w:r>
-      <w:r>
-        <w:rPr>
-          <w:rFonts w:ascii="Sakkal Majalla" w:hAnsi="Sakkal Majalla" w:cs="Sakkal Majalla"/>
-          <w:sz w:val="28"/>
-          <w:szCs w:val="28"/>
-        </w:rPr>
         <w:t>*******************************************************************</w:t>
       </w:r>
     </w:p>
@@ -3808,6 +3653,7 @@
       <w:r>
         <w:rPr>
           <w:rFonts w:ascii="Sakkal Majalla" w:hAnsi="Sakkal Majalla" w:cs="Sakkal Majalla"/>
+          <w:noProof/>
           <w:sz w:val="28"/>
           <w:szCs w:val="28"/>
         </w:rPr>
@@ -3883,29 +3729,16 @@
         </w:rPr>
         <w:t xml:space="preserve">The preceding code uses the </w:t>
       </w:r>
-      <w:proofErr w:type="gramStart"/>
-      <w:r>
-        <w:rPr>
-          <w:rFonts w:ascii="Sakkal Majalla" w:hAnsi="Sakkal Majalla" w:cs="Sakkal Majalla"/>
-          <w:b/>
-          <w:bCs/>
-          <w:color w:val="0070C0"/>
-          <w:sz w:val="28"/>
-          <w:szCs w:val="28"/>
-        </w:rPr>
-        <w:t>MapGet(</w:t>
-      </w:r>
-      <w:proofErr w:type="gramEnd"/>
-      <w:r>
-        <w:rPr>
-          <w:rFonts w:ascii="Sakkal Majalla" w:hAnsi="Sakkal Majalla" w:cs="Sakkal Majalla"/>
-          <w:b/>
-          <w:bCs/>
-          <w:color w:val="0070C0"/>
-          <w:sz w:val="28"/>
-          <w:szCs w:val="28"/>
-        </w:rPr>
-        <w:t>)</w:t>
+      <w:r>
+        <w:rPr>
+          <w:rFonts w:ascii="Sakkal Majalla" w:hAnsi="Sakkal Majalla" w:cs="Sakkal Majalla"/>
+          <w:b/>
+          <w:bCs/>
+          <w:color w:val="0070C0"/>
+          <w:sz w:val="28"/>
+          <w:szCs w:val="28"/>
+        </w:rPr>
+        <w:t>MapGet()</w:t>
       </w:r>
       <w:r>
         <w:rPr>
@@ -3924,29 +3757,16 @@
         </w:rPr>
         <w:t xml:space="preserve">method to map the GET request to the /weatherforecast endpoint. The </w:t>
       </w:r>
-      <w:proofErr w:type="gramStart"/>
-      <w:r>
-        <w:rPr>
-          <w:rFonts w:ascii="Sakkal Majalla" w:hAnsi="Sakkal Majalla" w:cs="Sakkal Majalla"/>
-          <w:b/>
-          <w:bCs/>
-          <w:color w:val="0070C0"/>
-          <w:sz w:val="28"/>
-          <w:szCs w:val="28"/>
-        </w:rPr>
-        <w:t>MapGet(</w:t>
-      </w:r>
-      <w:proofErr w:type="gramEnd"/>
-      <w:r>
-        <w:rPr>
-          <w:rFonts w:ascii="Sakkal Majalla" w:hAnsi="Sakkal Majalla" w:cs="Sakkal Majalla"/>
-          <w:b/>
-          <w:bCs/>
-          <w:color w:val="0070C0"/>
-          <w:sz w:val="28"/>
-          <w:szCs w:val="28"/>
-        </w:rPr>
-        <w:t>)</w:t>
+      <w:r>
+        <w:rPr>
+          <w:rFonts w:ascii="Sakkal Majalla" w:hAnsi="Sakkal Majalla" w:cs="Sakkal Majalla"/>
+          <w:b/>
+          <w:bCs/>
+          <w:color w:val="0070C0"/>
+          <w:sz w:val="28"/>
+          <w:szCs w:val="28"/>
+        </w:rPr>
+        <w:t>MapGet()</w:t>
       </w:r>
       <w:r>
         <w:rPr>
@@ -3965,29 +3785,16 @@
         </w:rPr>
         <w:t xml:space="preserve">method is an extension method of the IEndpointRouteBuilder interface. This interface is used to configure the endpoints in the application. Its extension method, </w:t>
       </w:r>
-      <w:proofErr w:type="gramStart"/>
-      <w:r>
-        <w:rPr>
-          <w:rFonts w:ascii="Sakkal Majalla" w:hAnsi="Sakkal Majalla" w:cs="Sakkal Majalla"/>
-          <w:b/>
-          <w:bCs/>
-          <w:color w:val="0070C0"/>
-          <w:sz w:val="28"/>
-          <w:szCs w:val="28"/>
-        </w:rPr>
-        <w:t>MapGet(</w:t>
-      </w:r>
-      <w:proofErr w:type="gramEnd"/>
-      <w:r>
-        <w:rPr>
-          <w:rFonts w:ascii="Sakkal Majalla" w:hAnsi="Sakkal Majalla" w:cs="Sakkal Majalla"/>
-          <w:b/>
-          <w:bCs/>
-          <w:color w:val="0070C0"/>
-          <w:sz w:val="28"/>
-          <w:szCs w:val="28"/>
-        </w:rPr>
-        <w:t>),</w:t>
+      <w:r>
+        <w:rPr>
+          <w:rFonts w:ascii="Sakkal Majalla" w:hAnsi="Sakkal Majalla" w:cs="Sakkal Majalla"/>
+          <w:b/>
+          <w:bCs/>
+          <w:color w:val="0070C0"/>
+          <w:sz w:val="28"/>
+          <w:szCs w:val="28"/>
+        </w:rPr>
+        <w:t>MapGet(),</w:t>
       </w:r>
       <w:r>
         <w:rPr>
@@ -4006,31 +3813,7 @@
           <w:sz w:val="28"/>
           <w:szCs w:val="28"/>
         </w:rPr>
-        <w:t xml:space="preserve">as </w:t>
-      </w:r>
-      <w:proofErr w:type="gramStart"/>
-      <w:r>
-        <w:rPr>
-          <w:rFonts w:ascii="Sakkal Majalla" w:hAnsi="Sakkal Majalla" w:cs="Sakkal Majalla"/>
-          <w:b/>
-          <w:bCs/>
-          <w:color w:val="0070C0"/>
-          <w:sz w:val="28"/>
-          <w:szCs w:val="28"/>
-        </w:rPr>
-        <w:t>WithName(</w:t>
-      </w:r>
-      <w:proofErr w:type="gramEnd"/>
-      <w:r>
-        <w:rPr>
-          <w:rFonts w:ascii="Sakkal Majalla" w:hAnsi="Sakkal Majalla" w:cs="Sakkal Majalla"/>
-          <w:b/>
-          <w:bCs/>
-          <w:color w:val="0070C0"/>
-          <w:sz w:val="28"/>
-          <w:szCs w:val="28"/>
-        </w:rPr>
-        <w:t>)</w:t>
+        <w:t>as WithName()</w:t>
       </w:r>
       <w:r>
         <w:rPr>
@@ -4049,29 +3832,16 @@
         </w:rPr>
         <w:t xml:space="preserve">and </w:t>
       </w:r>
-      <w:proofErr w:type="gramStart"/>
-      <w:r>
-        <w:rPr>
-          <w:rFonts w:ascii="Sakkal Majalla" w:hAnsi="Sakkal Majalla" w:cs="Sakkal Majalla"/>
-          <w:b/>
-          <w:bCs/>
-          <w:color w:val="0070C0"/>
-          <w:sz w:val="28"/>
-          <w:szCs w:val="28"/>
-        </w:rPr>
-        <w:t>WithOpenApi(</w:t>
-      </w:r>
-      <w:proofErr w:type="gramEnd"/>
-      <w:r>
-        <w:rPr>
-          <w:rFonts w:ascii="Sakkal Majalla" w:hAnsi="Sakkal Majalla" w:cs="Sakkal Majalla"/>
-          <w:b/>
-          <w:bCs/>
-          <w:color w:val="0070C0"/>
-          <w:sz w:val="28"/>
-          <w:szCs w:val="28"/>
-        </w:rPr>
-        <w:t>).</w:t>
+      <w:r>
+        <w:rPr>
+          <w:rFonts w:ascii="Sakkal Majalla" w:hAnsi="Sakkal Majalla" w:cs="Sakkal Majalla"/>
+          <w:b/>
+          <w:bCs/>
+          <w:color w:val="0070C0"/>
+          <w:sz w:val="28"/>
+          <w:szCs w:val="28"/>
+        </w:rPr>
+        <w:t>WithOpenApi().</w:t>
       </w:r>
       <w:r>
         <w:rPr>
@@ -4090,29 +3860,16 @@
         </w:rPr>
         <w:t xml:space="preserve">The </w:t>
       </w:r>
-      <w:proofErr w:type="gramStart"/>
-      <w:r>
-        <w:rPr>
-          <w:rFonts w:ascii="Sakkal Majalla" w:hAnsi="Sakkal Majalla" w:cs="Sakkal Majalla"/>
-          <w:b/>
-          <w:bCs/>
-          <w:color w:val="0070C0"/>
-          <w:sz w:val="28"/>
-          <w:szCs w:val="28"/>
-        </w:rPr>
-        <w:t>WithName(</w:t>
-      </w:r>
-      <w:proofErr w:type="gramEnd"/>
-      <w:r>
-        <w:rPr>
-          <w:rFonts w:ascii="Sakkal Majalla" w:hAnsi="Sakkal Majalla" w:cs="Sakkal Majalla"/>
-          <w:b/>
-          <w:bCs/>
-          <w:color w:val="0070C0"/>
-          <w:sz w:val="28"/>
-          <w:szCs w:val="28"/>
-        </w:rPr>
-        <w:t>)</w:t>
+      <w:r>
+        <w:rPr>
+          <w:rFonts w:ascii="Sakkal Majalla" w:hAnsi="Sakkal Majalla" w:cs="Sakkal Majalla"/>
+          <w:b/>
+          <w:bCs/>
+          <w:color w:val="0070C0"/>
+          <w:sz w:val="28"/>
+          <w:szCs w:val="28"/>
+        </w:rPr>
+        <w:t>WithName()</w:t>
       </w:r>
       <w:r>
         <w:rPr>
@@ -4131,29 +3888,16 @@
         </w:rPr>
         <w:t xml:space="preserve">method is used to set the name of the endpoint. The </w:t>
       </w:r>
-      <w:proofErr w:type="gramStart"/>
-      <w:r>
-        <w:rPr>
-          <w:rFonts w:ascii="Sakkal Majalla" w:hAnsi="Sakkal Majalla" w:cs="Sakkal Majalla"/>
-          <w:b/>
-          <w:bCs/>
-          <w:color w:val="0070C0"/>
-          <w:sz w:val="28"/>
-          <w:szCs w:val="28"/>
-        </w:rPr>
-        <w:t>WithOpenApi(</w:t>
-      </w:r>
-      <w:proofErr w:type="gramEnd"/>
-      <w:r>
-        <w:rPr>
-          <w:rFonts w:ascii="Sakkal Majalla" w:hAnsi="Sakkal Majalla" w:cs="Sakkal Majalla"/>
-          <w:b/>
-          <w:bCs/>
-          <w:color w:val="0070C0"/>
-          <w:sz w:val="28"/>
-          <w:szCs w:val="28"/>
-        </w:rPr>
-        <w:t>)</w:t>
+      <w:r>
+        <w:rPr>
+          <w:rFonts w:ascii="Sakkal Majalla" w:hAnsi="Sakkal Majalla" w:cs="Sakkal Majalla"/>
+          <w:b/>
+          <w:bCs/>
+          <w:color w:val="0070C0"/>
+          <w:sz w:val="28"/>
+          <w:szCs w:val="28"/>
+        </w:rPr>
+        <w:t>WithOpenApi()</w:t>
       </w:r>
       <w:r>
         <w:rPr>
@@ -4189,6 +3933,556 @@
           <w:szCs w:val="28"/>
         </w:rPr>
         <w:t>*******************************************************************</w:t>
+      </w:r>
+    </w:p>
+    <w:p>
+      <w:pPr>
+        <w:rPr>
+          <w:rFonts w:ascii="Sakkal Majalla" w:hAnsi="Sakkal Majalla" w:cs="Sakkal Majalla"/>
+          <w:sz w:val="28"/>
+          <w:szCs w:val="28"/>
+        </w:rPr>
+      </w:pPr>
+      <w:r>
+        <w:rPr>
+          <w:rFonts w:ascii="Sakkal Majalla" w:hAnsi="Sakkal Majalla" w:cs="Sakkal Majalla"/>
+          <w:sz w:val="28"/>
+          <w:szCs w:val="28"/>
+        </w:rPr>
+        <w:t xml:space="preserve">ASP.NET Core provides two types of routing: </w:t>
+      </w:r>
+      <w:r>
+        <w:rPr>
+          <w:rFonts w:ascii="Sakkal Majalla" w:hAnsi="Sakkal Majalla" w:cs="Sakkal Majalla"/>
+          <w:i/>
+          <w:iCs/>
+          <w:color w:val="002060"/>
+          <w:sz w:val="28"/>
+          <w:szCs w:val="28"/>
+        </w:rPr>
+        <w:t>conventional routing</w:t>
+      </w:r>
+      <w:r>
+        <w:rPr>
+          <w:rFonts w:ascii="Sakkal Majalla" w:hAnsi="Sakkal Majalla" w:cs="Sakkal Majalla"/>
+          <w:color w:val="002060"/>
+          <w:sz w:val="28"/>
+          <w:szCs w:val="28"/>
+        </w:rPr>
+        <w:t xml:space="preserve"> </w:t>
+      </w:r>
+      <w:r>
+        <w:rPr>
+          <w:rFonts w:ascii="Sakkal Majalla" w:hAnsi="Sakkal Majalla" w:cs="Sakkal Majalla"/>
+          <w:sz w:val="28"/>
+          <w:szCs w:val="28"/>
+        </w:rPr>
+        <w:t xml:space="preserve">and </w:t>
+      </w:r>
+      <w:r>
+        <w:rPr>
+          <w:rFonts w:ascii="Sakkal Majalla" w:hAnsi="Sakkal Majalla" w:cs="Sakkal Majalla"/>
+          <w:i/>
+          <w:iCs/>
+          <w:color w:val="002060"/>
+          <w:sz w:val="28"/>
+          <w:szCs w:val="28"/>
+        </w:rPr>
+        <w:t>attribute routing</w:t>
+      </w:r>
+      <w:r>
+        <w:rPr>
+          <w:rFonts w:ascii="Sakkal Majalla" w:hAnsi="Sakkal Majalla" w:cs="Sakkal Majalla"/>
+          <w:sz w:val="28"/>
+          <w:szCs w:val="28"/>
+        </w:rPr>
+        <w:t xml:space="preserve">. Conventional routing is typically </w:t>
+      </w:r>
+      <w:r>
+        <w:rPr>
+          <w:rFonts w:ascii="Sakkal Majalla" w:hAnsi="Sakkal Majalla" w:cs="Sakkal Majalla"/>
+          <w:b/>
+          <w:bCs/>
+          <w:color w:val="00B050"/>
+          <w:sz w:val="28"/>
+          <w:szCs w:val="28"/>
+        </w:rPr>
+        <w:t>used for ASP.NET Core MVC applications</w:t>
+      </w:r>
+      <w:r>
+        <w:rPr>
+          <w:rFonts w:ascii="Sakkal Majalla" w:hAnsi="Sakkal Majalla" w:cs="Sakkal Majalla"/>
+          <w:sz w:val="28"/>
+          <w:szCs w:val="28"/>
+        </w:rPr>
+        <w:t xml:space="preserve">, </w:t>
+      </w:r>
+      <w:r>
+        <w:rPr>
+          <w:rFonts w:ascii="Sakkal Majalla" w:hAnsi="Sakkal Majalla" w:cs="Sakkal Majalla"/>
+          <w:b/>
+          <w:bCs/>
+          <w:i/>
+          <w:iCs/>
+          <w:color w:val="00B0F0"/>
+          <w:sz w:val="28"/>
+          <w:szCs w:val="28"/>
+        </w:rPr>
+        <w:t>while ASP.NET Core web APIs use attribute routing</w:t>
+      </w:r>
+      <w:r>
+        <w:rPr>
+          <w:rFonts w:ascii="Sakkal Majalla" w:hAnsi="Sakkal Majalla" w:cs="Sakkal Majalla"/>
+          <w:sz w:val="28"/>
+          <w:szCs w:val="28"/>
+        </w:rPr>
+        <w:t>.</w:t>
+      </w:r>
+    </w:p>
+    <w:p>
+      <w:pPr>
+        <w:ind w:firstLine="720"/>
+        <w:rPr>
+          <w:rFonts w:ascii="Sakkal Majalla" w:hAnsi="Sakkal Majalla" w:cs="Sakkal Majalla"/>
+          <w:sz w:val="28"/>
+          <w:szCs w:val="28"/>
+        </w:rPr>
+      </w:pPr>
+      <w:r>
+        <w:rPr>
+          <w:rFonts w:ascii="Sakkal Majalla" w:hAnsi="Sakkal Majalla" w:cs="Sakkal Majalla"/>
+          <w:sz w:val="28"/>
+          <w:szCs w:val="28"/>
+        </w:rPr>
+        <w:t>*******************************************************************</w:t>
+      </w:r>
+    </w:p>
+    <w:p>
+      <w:pPr>
+        <w:rPr>
+          <w:rFonts w:ascii="Sakkal Majalla" w:hAnsi="Sakkal Majalla" w:cs="Sakkal Majalla"/>
+          <w:sz w:val="28"/>
+          <w:szCs w:val="28"/>
+        </w:rPr>
+      </w:pPr>
+    </w:p>
+    <w:p>
+      <w:pPr>
+        <w:rPr>
+          <w:rFonts w:ascii="Sakkal Majalla" w:hAnsi="Sakkal Majalla" w:cs="Sakkal Majalla"/>
+          <w:sz w:val="28"/>
+          <w:szCs w:val="28"/>
+        </w:rPr>
+      </w:pPr>
+    </w:p>
+    <w:p>
+      <w:pPr>
+        <w:rPr>
+          <w:rFonts w:ascii="Sakkal Majalla" w:hAnsi="Sakkal Majalla" w:cs="Sakkal Majalla"/>
+          <w:i/>
+          <w:iCs/>
+          <w:color w:val="E97132" w:themeColor="accent2"/>
+          <w:sz w:val="28"/>
+          <w:szCs w:val="28"/>
+        </w:rPr>
+      </w:pPr>
+      <w:r>
+        <w:rPr>
+          <w:rFonts w:ascii="Sakkal Majalla" w:hAnsi="Sakkal Majalla" w:cs="Sakkal Majalla"/>
+          <w:i/>
+          <w:iCs/>
+          <w:color w:val="E97132" w:themeColor="accent2"/>
+          <w:sz w:val="28"/>
+          <w:szCs w:val="28"/>
+        </w:rPr>
+        <w:lastRenderedPageBreak/>
+        <w:t xml:space="preserve">app.MapControllers(); </w:t>
+      </w:r>
+    </w:p>
+    <w:p>
+      <w:pPr>
+        <w:rPr>
+          <w:rFonts w:ascii="Sakkal Majalla" w:hAnsi="Sakkal Majalla" w:cs="Sakkal Majalla"/>
+          <w:sz w:val="28"/>
+          <w:szCs w:val="28"/>
+        </w:rPr>
+      </w:pPr>
+      <w:r>
+        <w:rPr>
+          <w:rFonts w:ascii="Sakkal Majalla" w:hAnsi="Sakkal Majalla" w:cs="Sakkal Majalla"/>
+          <w:sz w:val="28"/>
+          <w:szCs w:val="28"/>
+        </w:rPr>
+        <w:t xml:space="preserve">This line of code adds endpoints for controller actions to the </w:t>
+      </w:r>
+      <w:r>
+        <w:rPr>
+          <w:rFonts w:ascii="Sakkal Majalla" w:hAnsi="Sakkal Majalla" w:cs="Sakkal Majalla"/>
+          <w:b/>
+          <w:bCs/>
+          <w:i/>
+          <w:iCs/>
+          <w:color w:val="156082" w:themeColor="accent1"/>
+          <w:sz w:val="28"/>
+          <w:szCs w:val="28"/>
+        </w:rPr>
+        <w:t>IEndpointRouteBuilder instance</w:t>
+      </w:r>
+      <w:r>
+        <w:rPr>
+          <w:rFonts w:ascii="Sakkal Majalla" w:hAnsi="Sakkal Majalla" w:cs="Sakkal Majalla"/>
+          <w:color w:val="156082" w:themeColor="accent1"/>
+          <w:sz w:val="28"/>
+          <w:szCs w:val="28"/>
+        </w:rPr>
+        <w:t xml:space="preserve"> </w:t>
+      </w:r>
+      <w:r>
+        <w:rPr>
+          <w:rFonts w:ascii="Sakkal Majalla" w:hAnsi="Sakkal Majalla" w:cs="Sakkal Majalla"/>
+          <w:sz w:val="28"/>
+          <w:szCs w:val="28"/>
+        </w:rPr>
+        <w:t>without specifying any routes. To specify the routes, we need to use the [</w:t>
+      </w:r>
+      <w:r>
+        <w:rPr>
+          <w:rFonts w:ascii="Sakkal Majalla" w:hAnsi="Sakkal Majalla" w:cs="Sakkal Majalla"/>
+          <w:b/>
+          <w:bCs/>
+          <w:i/>
+          <w:iCs/>
+          <w:color w:val="156082" w:themeColor="accent1"/>
+          <w:sz w:val="28"/>
+          <w:szCs w:val="28"/>
+        </w:rPr>
+        <w:t>Route</w:t>
+      </w:r>
+      <w:r>
+        <w:rPr>
+          <w:rFonts w:ascii="Sakkal Majalla" w:hAnsi="Sakkal Majalla" w:cs="Sakkal Majalla"/>
+          <w:sz w:val="28"/>
+          <w:szCs w:val="28"/>
+        </w:rPr>
+        <w:t>] attribute on the controller class and the action methods.</w:t>
+      </w:r>
+    </w:p>
+    <w:p>
+      <w:pPr>
+        <w:ind w:firstLine="720"/>
+        <w:rPr>
+          <w:rFonts w:ascii="Sakkal Majalla" w:hAnsi="Sakkal Majalla" w:cs="Sakkal Majalla"/>
+          <w:sz w:val="28"/>
+          <w:szCs w:val="28"/>
+        </w:rPr>
+      </w:pPr>
+      <w:r>
+        <w:rPr>
+          <w:rFonts w:ascii="Sakkal Majalla" w:hAnsi="Sakkal Majalla" w:cs="Sakkal Majalla"/>
+          <w:sz w:val="28"/>
+          <w:szCs w:val="28"/>
+        </w:rPr>
+        <w:t>*******************************************************************</w:t>
+      </w:r>
+    </w:p>
+    <w:p>
+      <w:pPr>
+        <w:rPr>
+          <w:rFonts w:ascii="Sakkal Majalla" w:hAnsi="Sakkal Majalla" w:cs="Sakkal Majalla"/>
+          <w:sz w:val="28"/>
+          <w:szCs w:val="28"/>
+        </w:rPr>
+      </w:pPr>
+      <w:r>
+        <w:rPr>
+          <w:rFonts w:ascii="Sakkal Majalla" w:hAnsi="Sakkal Majalla" w:cs="Sakkal Majalla"/>
+          <w:sz w:val="28"/>
+          <w:szCs w:val="28"/>
+        </w:rPr>
+        <w:t xml:space="preserve">ASP.NET Core has some built-in route tokens, such as </w:t>
+      </w:r>
+      <w:r>
+        <w:rPr>
+          <w:rFonts w:ascii="Sakkal Majalla" w:hAnsi="Sakkal Majalla" w:cs="Sakkal Majalla"/>
+          <w:i/>
+          <w:iCs/>
+          <w:color w:val="45B0E1" w:themeColor="accent1" w:themeTint="99"/>
+          <w:sz w:val="28"/>
+          <w:szCs w:val="28"/>
+        </w:rPr>
+        <w:t>[controller]</w:t>
+      </w:r>
+      <w:r>
+        <w:rPr>
+          <w:rFonts w:ascii="Sakkal Majalla" w:hAnsi="Sakkal Majalla" w:cs="Sakkal Majalla"/>
+          <w:sz w:val="28"/>
+          <w:szCs w:val="28"/>
+        </w:rPr>
+        <w:t xml:space="preserve">, </w:t>
+      </w:r>
+      <w:r>
+        <w:rPr>
+          <w:rFonts w:ascii="Sakkal Majalla" w:hAnsi="Sakkal Majalla" w:cs="Sakkal Majalla"/>
+          <w:i/>
+          <w:iCs/>
+          <w:color w:val="45B0E1" w:themeColor="accent1" w:themeTint="99"/>
+          <w:sz w:val="28"/>
+          <w:szCs w:val="28"/>
+        </w:rPr>
+        <w:t>[action]</w:t>
+      </w:r>
+      <w:r>
+        <w:rPr>
+          <w:rFonts w:ascii="Sakkal Majalla" w:hAnsi="Sakkal Majalla" w:cs="Sakkal Majalla"/>
+          <w:sz w:val="28"/>
+          <w:szCs w:val="28"/>
+        </w:rPr>
+        <w:t xml:space="preserve">, </w:t>
+      </w:r>
+      <w:r>
+        <w:rPr>
+          <w:rFonts w:ascii="Sakkal Majalla" w:hAnsi="Sakkal Majalla" w:cs="Sakkal Majalla"/>
+          <w:i/>
+          <w:iCs/>
+          <w:color w:val="45B0E1" w:themeColor="accent1" w:themeTint="99"/>
+          <w:sz w:val="28"/>
+          <w:szCs w:val="28"/>
+        </w:rPr>
+        <w:t>[area]</w:t>
+      </w:r>
+      <w:r>
+        <w:rPr>
+          <w:rFonts w:ascii="Sakkal Majalla" w:hAnsi="Sakkal Majalla" w:cs="Sakkal Majalla"/>
+          <w:sz w:val="28"/>
+          <w:szCs w:val="28"/>
+        </w:rPr>
+        <w:t xml:space="preserve">, </w:t>
+      </w:r>
+      <w:r>
+        <w:rPr>
+          <w:rFonts w:ascii="Sakkal Majalla" w:hAnsi="Sakkal Majalla" w:cs="Sakkal Majalla"/>
+          <w:i/>
+          <w:iCs/>
+          <w:color w:val="45B0E1" w:themeColor="accent1" w:themeTint="99"/>
+          <w:sz w:val="28"/>
+          <w:szCs w:val="28"/>
+        </w:rPr>
+        <w:t>[page]</w:t>
+      </w:r>
+      <w:r>
+        <w:rPr>
+          <w:rFonts w:ascii="Sakkal Majalla" w:hAnsi="Sakkal Majalla" w:cs="Sakkal Majalla"/>
+          <w:sz w:val="28"/>
+          <w:szCs w:val="28"/>
+        </w:rPr>
+        <w:t>, and so on. These tokens are enclosed in square brackets ([]) and will be replaced with the corresponding values. Note that these tokens are reserved route parameter names and should not be used as a route parameter like {controller}.</w:t>
+      </w:r>
+    </w:p>
+    <w:p>
+      <w:pPr>
+        <w:ind w:firstLine="720"/>
+        <w:rPr>
+          <w:rFonts w:ascii="Sakkal Majalla" w:hAnsi="Sakkal Majalla" w:cs="Sakkal Majalla"/>
+          <w:sz w:val="28"/>
+          <w:szCs w:val="28"/>
+        </w:rPr>
+      </w:pPr>
+      <w:r>
+        <w:rPr>
+          <w:rFonts w:ascii="Sakkal Majalla" w:hAnsi="Sakkal Majalla" w:cs="Sakkal Majalla"/>
+          <w:sz w:val="28"/>
+          <w:szCs w:val="28"/>
+        </w:rPr>
+        <w:t>*******************************************************************</w:t>
+      </w:r>
+    </w:p>
+    <w:p>
+      <w:pPr>
+        <w:rPr>
+          <w:rFonts w:ascii="Sakkal Majalla" w:hAnsi="Sakkal Majalla" w:cs="Sakkal Majalla"/>
+          <w:b/>
+          <w:bCs/>
+          <w:color w:val="00B050"/>
+          <w:sz w:val="28"/>
+          <w:szCs w:val="28"/>
+        </w:rPr>
+      </w:pPr>
+      <w:r>
+        <w:rPr>
+          <w:rFonts w:ascii="Sakkal Majalla" w:hAnsi="Sakkal Majalla" w:cs="Sakkal Majalla"/>
+          <w:sz w:val="28"/>
+          <w:szCs w:val="28"/>
+        </w:rPr>
+        <w:t xml:space="preserve">ASP.NET Core provides a way to configure the route value globally. Add the following code to the </w:t>
+      </w:r>
+      <w:r>
+        <w:rPr>
+          <w:rFonts w:ascii="Sakkal Majalla" w:hAnsi="Sakkal Majalla" w:cs="Sakkal Majalla"/>
+          <w:b/>
+          <w:bCs/>
+          <w:color w:val="00B050"/>
+          <w:sz w:val="28"/>
+          <w:szCs w:val="28"/>
+        </w:rPr>
+        <w:t>Program.cs file</w:t>
+      </w:r>
+      <w:r>
+        <w:rPr>
+          <w:rFonts w:ascii="Sakkal Majalla" w:hAnsi="Sakkal Majalla" w:cs="Sakkal Majalla"/>
+          <w:sz w:val="28"/>
+          <w:szCs w:val="28"/>
+        </w:rPr>
+        <w:t xml:space="preserve">: </w:t>
+      </w:r>
+      <w:r>
+        <w:rPr>
+          <w:rFonts w:ascii="Sakkal Majalla" w:hAnsi="Sakkal Majalla" w:cs="Sakkal Majalla"/>
+          <w:i/>
+          <w:iCs/>
+          <w:color w:val="0070C0"/>
+          <w:sz w:val="28"/>
+          <w:szCs w:val="28"/>
+        </w:rPr>
+        <w:t>builder.Services.AddRouting(options =&gt; options.LowercaseUrls = true);</w:t>
+      </w:r>
+    </w:p>
+    <w:p>
+      <w:pPr>
+        <w:ind w:firstLine="720"/>
+        <w:rPr>
+          <w:rFonts w:ascii="Sakkal Majalla" w:hAnsi="Sakkal Majalla" w:cs="Sakkal Majalla"/>
+          <w:sz w:val="28"/>
+          <w:szCs w:val="28"/>
+        </w:rPr>
+      </w:pPr>
+      <w:r>
+        <w:rPr>
+          <w:rFonts w:ascii="Sakkal Majalla" w:hAnsi="Sakkal Majalla" w:cs="Sakkal Majalla"/>
+          <w:sz w:val="28"/>
+          <w:szCs w:val="28"/>
+        </w:rPr>
+        <w:t>*******************************************************************</w:t>
+      </w:r>
+    </w:p>
+    <w:p>
+      <w:pPr>
+        <w:rPr>
+          <w:rFonts w:ascii="Sakkal Majalla" w:hAnsi="Sakkal Majalla" w:cs="Sakkal Majalla"/>
+          <w:sz w:val="28"/>
+          <w:szCs w:val="28"/>
+        </w:rPr>
+      </w:pPr>
+      <w:r>
+        <w:rPr>
+          <w:rFonts w:ascii="Sakkal Majalla" w:hAnsi="Sakkal Majalla" w:cs="Sakkal Majalla"/>
+          <w:sz w:val="28"/>
+          <w:szCs w:val="28"/>
+        </w:rPr>
+        <w:drawing>
+          <wp:inline distT="0" distB="0" distL="0" distR="0" wp14:anchorId="494316F9" wp14:editId="56091E90">
+            <wp:extent cx="5943600" cy="1877695"/>
+            <wp:effectExtent l="0" t="0" r="0" b="8255"/>
+            <wp:docPr id="1279556273" name="Picture 1"/>
+            <wp:cNvGraphicFramePr>
+              <a:graphicFrameLocks xmlns:a="http://schemas.openxmlformats.org/drawingml/2006/main" noChangeAspect="1"/>
+            </wp:cNvGraphicFramePr>
+            <a:graphic xmlns:a="http://schemas.openxmlformats.org/drawingml/2006/main">
+              <a:graphicData uri="http://schemas.openxmlformats.org/drawingml/2006/picture">
+                <pic:pic xmlns:pic="http://schemas.openxmlformats.org/drawingml/2006/picture">
+                  <pic:nvPicPr>
+                    <pic:cNvPr id="1279556273" name=""/>
+                    <pic:cNvPicPr/>
+                  </pic:nvPicPr>
+                  <pic:blipFill>
+                    <a:blip r:embed="rId13"/>
+                    <a:stretch>
+                      <a:fillRect/>
+                    </a:stretch>
+                  </pic:blipFill>
+                  <pic:spPr>
+                    <a:xfrm>
+                      <a:off x="0" y="0"/>
+                      <a:ext cx="5943600" cy="1877695"/>
+                    </a:xfrm>
+                    <a:prstGeom prst="rect">
+                      <a:avLst/>
+                    </a:prstGeom>
+                  </pic:spPr>
+                </pic:pic>
+              </a:graphicData>
+            </a:graphic>
+          </wp:inline>
+        </w:drawing>
+      </w:r>
+    </w:p>
+    <w:p>
+      <w:pPr>
+        <w:ind w:firstLine="720"/>
+        <w:rPr>
+          <w:rFonts w:ascii="Sakkal Majalla" w:hAnsi="Sakkal Majalla" w:cs="Sakkal Majalla"/>
+          <w:sz w:val="28"/>
+          <w:szCs w:val="28"/>
+        </w:rPr>
+      </w:pPr>
+      <w:r>
+        <w:rPr>
+          <w:rFonts w:ascii="Sakkal Majalla" w:hAnsi="Sakkal Majalla" w:cs="Sakkal Majalla"/>
+          <w:sz w:val="28"/>
+          <w:szCs w:val="28"/>
+        </w:rPr>
+        <w:t>*******************************************************************</w:t>
+      </w:r>
+    </w:p>
+    <w:p>
+      <w:pPr>
+        <w:rPr>
+          <w:rFonts w:ascii="Sakkal Majalla" w:hAnsi="Sakkal Majalla" w:cs="Sakkal Majalla"/>
+          <w:sz w:val="28"/>
+          <w:szCs w:val="28"/>
+        </w:rPr>
+      </w:pPr>
+      <w:r>
+        <w:rPr>
+          <w:rFonts w:ascii="Sakkal Majalla" w:hAnsi="Sakkal Majalla" w:cs="Sakkal Majalla"/>
+          <w:sz w:val="28"/>
+          <w:szCs w:val="28"/>
+        </w:rPr>
+        <w:lastRenderedPageBreak/>
+        <w:drawing>
+          <wp:inline distT="0" distB="0" distL="0" distR="0" wp14:anchorId="0E378648" wp14:editId="329B2B8D">
+            <wp:extent cx="5943600" cy="1664335"/>
+            <wp:effectExtent l="0" t="0" r="0" b="0"/>
+            <wp:docPr id="1277168274" name="Picture 1"/>
+            <wp:cNvGraphicFramePr>
+              <a:graphicFrameLocks xmlns:a="http://schemas.openxmlformats.org/drawingml/2006/main" noChangeAspect="1"/>
+            </wp:cNvGraphicFramePr>
+            <a:graphic xmlns:a="http://schemas.openxmlformats.org/drawingml/2006/main">
+              <a:graphicData uri="http://schemas.openxmlformats.org/drawingml/2006/picture">
+                <pic:pic xmlns:pic="http://schemas.openxmlformats.org/drawingml/2006/picture">
+                  <pic:nvPicPr>
+                    <pic:cNvPr id="1277168274" name=""/>
+                    <pic:cNvPicPr/>
+                  </pic:nvPicPr>
+                  <pic:blipFill>
+                    <a:blip r:embed="rId14"/>
+                    <a:stretch>
+                      <a:fillRect/>
+                    </a:stretch>
+                  </pic:blipFill>
+                  <pic:spPr>
+                    <a:xfrm>
+                      <a:off x="0" y="0"/>
+                      <a:ext cx="5943600" cy="1664335"/>
+                    </a:xfrm>
+                    <a:prstGeom prst="rect">
+                      <a:avLst/>
+                    </a:prstGeom>
+                  </pic:spPr>
+                </pic:pic>
+              </a:graphicData>
+            </a:graphic>
+          </wp:inline>
+        </w:drawing>
       </w:r>
     </w:p>
     <w:sectPr>
@@ -4366,8 +4660,124 @@
       </w:rPr>
     </w:lvl>
   </w:abstractNum>
+  <w:abstractNum w:abstractNumId="1" w15:restartNumberingAfterBreak="0">
+    <w:nsid w:val="507F50F4"/>
+    <w:multiLevelType w:val="hybridMultilevel"/>
+    <w:tmpl w:val="E2580156"/>
+    <w:lvl w:ilvl="0" w:tplc="04090001">
+      <w:start w:val="1"/>
+      <w:numFmt w:val="bullet"/>
+      <w:lvlText w:val=""/>
+      <w:lvlJc w:val="left"/>
+      <w:pPr>
+        <w:ind w:left="720" w:hanging="360"/>
+      </w:pPr>
+      <w:rPr>
+        <w:rFonts w:ascii="Symbol" w:hAnsi="Symbol" w:hint="default"/>
+      </w:rPr>
+    </w:lvl>
+    <w:lvl w:ilvl="1" w:tplc="04090003" w:tentative="1">
+      <w:start w:val="1"/>
+      <w:numFmt w:val="bullet"/>
+      <w:lvlText w:val="o"/>
+      <w:lvlJc w:val="left"/>
+      <w:pPr>
+        <w:ind w:left="1440" w:hanging="360"/>
+      </w:pPr>
+      <w:rPr>
+        <w:rFonts w:ascii="Courier New" w:hAnsi="Courier New" w:cs="Courier New" w:hint="default"/>
+      </w:rPr>
+    </w:lvl>
+    <w:lvl w:ilvl="2" w:tplc="04090005" w:tentative="1">
+      <w:start w:val="1"/>
+      <w:numFmt w:val="bullet"/>
+      <w:lvlText w:val=""/>
+      <w:lvlJc w:val="left"/>
+      <w:pPr>
+        <w:ind w:left="2160" w:hanging="360"/>
+      </w:pPr>
+      <w:rPr>
+        <w:rFonts w:ascii="Wingdings" w:hAnsi="Wingdings" w:hint="default"/>
+      </w:rPr>
+    </w:lvl>
+    <w:lvl w:ilvl="3" w:tplc="04090001" w:tentative="1">
+      <w:start w:val="1"/>
+      <w:numFmt w:val="bullet"/>
+      <w:lvlText w:val=""/>
+      <w:lvlJc w:val="left"/>
+      <w:pPr>
+        <w:ind w:left="2880" w:hanging="360"/>
+      </w:pPr>
+      <w:rPr>
+        <w:rFonts w:ascii="Symbol" w:hAnsi="Symbol" w:hint="default"/>
+      </w:rPr>
+    </w:lvl>
+    <w:lvl w:ilvl="4" w:tplc="04090003" w:tentative="1">
+      <w:start w:val="1"/>
+      <w:numFmt w:val="bullet"/>
+      <w:lvlText w:val="o"/>
+      <w:lvlJc w:val="left"/>
+      <w:pPr>
+        <w:ind w:left="3600" w:hanging="360"/>
+      </w:pPr>
+      <w:rPr>
+        <w:rFonts w:ascii="Courier New" w:hAnsi="Courier New" w:cs="Courier New" w:hint="default"/>
+      </w:rPr>
+    </w:lvl>
+    <w:lvl w:ilvl="5" w:tplc="04090005" w:tentative="1">
+      <w:start w:val="1"/>
+      <w:numFmt w:val="bullet"/>
+      <w:lvlText w:val=""/>
+      <w:lvlJc w:val="left"/>
+      <w:pPr>
+        <w:ind w:left="4320" w:hanging="360"/>
+      </w:pPr>
+      <w:rPr>
+        <w:rFonts w:ascii="Wingdings" w:hAnsi="Wingdings" w:hint="default"/>
+      </w:rPr>
+    </w:lvl>
+    <w:lvl w:ilvl="6" w:tplc="04090001" w:tentative="1">
+      <w:start w:val="1"/>
+      <w:numFmt w:val="bullet"/>
+      <w:lvlText w:val=""/>
+      <w:lvlJc w:val="left"/>
+      <w:pPr>
+        <w:ind w:left="5040" w:hanging="360"/>
+      </w:pPr>
+      <w:rPr>
+        <w:rFonts w:ascii="Symbol" w:hAnsi="Symbol" w:hint="default"/>
+      </w:rPr>
+    </w:lvl>
+    <w:lvl w:ilvl="7" w:tplc="04090003" w:tentative="1">
+      <w:start w:val="1"/>
+      <w:numFmt w:val="bullet"/>
+      <w:lvlText w:val="o"/>
+      <w:lvlJc w:val="left"/>
+      <w:pPr>
+        <w:ind w:left="5760" w:hanging="360"/>
+      </w:pPr>
+      <w:rPr>
+        <w:rFonts w:ascii="Courier New" w:hAnsi="Courier New" w:cs="Courier New" w:hint="default"/>
+      </w:rPr>
+    </w:lvl>
+    <w:lvl w:ilvl="8" w:tplc="04090005" w:tentative="1">
+      <w:start w:val="1"/>
+      <w:numFmt w:val="bullet"/>
+      <w:lvlText w:val=""/>
+      <w:lvlJc w:val="left"/>
+      <w:pPr>
+        <w:ind w:left="6480" w:hanging="360"/>
+      </w:pPr>
+      <w:rPr>
+        <w:rFonts w:ascii="Wingdings" w:hAnsi="Wingdings" w:hint="default"/>
+      </w:rPr>
+    </w:lvl>
+  </w:abstractNum>
   <w:num w:numId="1" w16cid:durableId="1171145113">
     <w:abstractNumId w:val="0"/>
+  </w:num>
+  <w:num w:numId="2" w16cid:durableId="313796732">
+    <w:abstractNumId w:val="1"/>
   </w:num>
 </w:numbering>
 </file>

</xml_diff>